<commit_message>
Finish until DB BR 440
</commit_message>
<xml_diff>
--- a/raildriver-UK-Remapped.docx
+++ b/raildriver-UK-Remapped.docx
@@ -50760,25 +50760,7 @@
           <w:szCs w:val="16"/>
         </w:rPr>
         <w:tab/>
-        <w:t xml:space="preserve">           Class 3</w:t>
-      </w:r>
-      <w:r>
-        <w:rPr>
-          <w:rFonts w:eastAsia="arial" w:ascii="arial" w:hAnsi="arial"/>
-          <w:color w:val="000000"/>
-          <w:sz w:val="16"/>
-          <w:szCs w:val="16"/>
-        </w:rPr>
-        <w:t>31</w:t>
-      </w:r>
-      <w:r>
-        <w:rPr>
-          <w:rFonts w:eastAsia="arial" w:ascii="arial" w:hAnsi="arial"/>
-          <w:color w:val="000000"/>
-          <w:sz w:val="16"/>
-          <w:szCs w:val="16"/>
-        </w:rPr>
-        <w:t>-1</w:t>
+        <w:t xml:space="preserve">           Class 331-1</w:t>
       </w:r>
     </w:p>
     <w:tbl>
@@ -50910,6 +50892,7 @@
                 <w:sz w:val="16"/>
                 <w:szCs w:val="16"/>
               </w:rPr>
+              <w:t>Battery On</w:t>
             </w:r>
           </w:p>
         </w:tc>
@@ -51000,7 +50983,11 @@
               </w:rPr>
             </w:pPr>
             <w:r>
-              <w:rPr/>
+              <w:rPr>
+                <w:color w:val="000000"/>
+                <w:sz w:val="16"/>
+                <w:szCs w:val="16"/>
+              </w:rPr>
             </w:r>
           </w:p>
         </w:tc>
@@ -51055,32 +51042,39 @@
               </w:rPr>
             </w:pPr>
             <w:r>
-              <w:rPr/>
-            </w:r>
-          </w:p>
-        </w:tc>
-        <w:tc>
-          <w:tcPr>
-            <w:tcW w:w="1016" w:type="dxa"/>
-            <w:tcBorders>
-              <w:top w:val="single" w:sz="4" w:space="0" w:color="000000"/>
-              <w:left w:val="single" w:sz="4" w:space="0" w:color="000000"/>
-              <w:bottom w:val="single" w:sz="4" w:space="0" w:color="000000"/>
-            </w:tcBorders>
-            <w:vAlign w:val="bottom"/>
-          </w:tcPr>
-          <w:p>
-            <w:pPr>
-              <w:pStyle w:val="Normal"/>
-              <w:widowControl w:val="false"/>
-              <w:jc w:val="center"/>
-              <w:rPr>
-                <w:sz w:val="16"/>
-                <w:szCs w:val="16"/>
-              </w:rPr>
-            </w:pPr>
-            <w:r>
-              <w:rPr/>
+              <w:rPr>
+                <w:color w:val="000000"/>
+                <w:sz w:val="16"/>
+                <w:szCs w:val="16"/>
+              </w:rPr>
+            </w:r>
+          </w:p>
+        </w:tc>
+        <w:tc>
+          <w:tcPr>
+            <w:tcW w:w="1016" w:type="dxa"/>
+            <w:tcBorders>
+              <w:top w:val="single" w:sz="4" w:space="0" w:color="000000"/>
+              <w:left w:val="single" w:sz="4" w:space="0" w:color="000000"/>
+              <w:bottom w:val="single" w:sz="4" w:space="0" w:color="000000"/>
+            </w:tcBorders>
+            <w:vAlign w:val="bottom"/>
+          </w:tcPr>
+          <w:p>
+            <w:pPr>
+              <w:pStyle w:val="Normal"/>
+              <w:widowControl w:val="false"/>
+              <w:jc w:val="center"/>
+              <w:rPr>
+                <w:sz w:val="16"/>
+                <w:szCs w:val="16"/>
+              </w:rPr>
+            </w:pPr>
+            <w:r>
+              <w:rPr>
+                <w:sz w:val="16"/>
+                <w:szCs w:val="16"/>
+              </w:rPr>
             </w:r>
           </w:p>
         </w:tc>
@@ -51301,25 +51295,7 @@
           <w:szCs w:val="16"/>
         </w:rPr>
         <w:tab/>
-        <w:t xml:space="preserve">           Class 3</w:t>
-      </w:r>
-      <w:r>
-        <w:rPr>
-          <w:rFonts w:eastAsia="arial" w:ascii="arial" w:hAnsi="arial"/>
-          <w:color w:val="000000"/>
-          <w:sz w:val="16"/>
-          <w:szCs w:val="16"/>
-        </w:rPr>
-        <w:t>31</w:t>
-      </w:r>
-      <w:r>
-        <w:rPr>
-          <w:rFonts w:eastAsia="arial" w:ascii="arial" w:hAnsi="arial"/>
-          <w:color w:val="000000"/>
-          <w:sz w:val="16"/>
-          <w:szCs w:val="16"/>
-        </w:rPr>
-        <w:t>-2</w:t>
+        <w:t xml:space="preserve">           Class 331-2</w:t>
       </w:r>
     </w:p>
     <w:tbl>
@@ -51450,6 +51426,7 @@
                 <w:sz w:val="16"/>
                 <w:szCs w:val="16"/>
               </w:rPr>
+              <w:t>Battery Off</w:t>
             </w:r>
           </w:p>
         </w:tc>
@@ -51539,33 +51516,40 @@
               </w:rPr>
             </w:pPr>
             <w:r>
-              <w:rPr/>
-            </w:r>
-          </w:p>
-        </w:tc>
-        <w:tc>
-          <w:tcPr>
-            <w:tcW w:w="1016" w:type="dxa"/>
-            <w:tcBorders>
-              <w:top w:val="single" w:sz="4" w:space="0" w:color="000000"/>
-              <w:left w:val="single" w:sz="4" w:space="0" w:color="000000"/>
-              <w:bottom w:val="single" w:sz="4" w:space="0" w:color="000000"/>
-            </w:tcBorders>
-            <w:vAlign w:val="bottom"/>
-          </w:tcPr>
-          <w:p>
-            <w:pPr>
-              <w:pStyle w:val="Normal"/>
-              <w:widowControl w:val="false"/>
-              <w:jc w:val="center"/>
-              <w:rPr>
-                <w:color w:val="000000"/>
-                <w:sz w:val="16"/>
-                <w:szCs w:val="16"/>
-              </w:rPr>
-            </w:pPr>
-            <w:r>
-              <w:rPr/>
+              <w:rPr>
+                <w:sz w:val="16"/>
+                <w:szCs w:val="16"/>
+              </w:rPr>
+            </w:r>
+          </w:p>
+        </w:tc>
+        <w:tc>
+          <w:tcPr>
+            <w:tcW w:w="1016" w:type="dxa"/>
+            <w:tcBorders>
+              <w:top w:val="single" w:sz="4" w:space="0" w:color="000000"/>
+              <w:left w:val="single" w:sz="4" w:space="0" w:color="000000"/>
+              <w:bottom w:val="single" w:sz="4" w:space="0" w:color="000000"/>
+            </w:tcBorders>
+            <w:vAlign w:val="bottom"/>
+          </w:tcPr>
+          <w:p>
+            <w:pPr>
+              <w:pStyle w:val="Normal"/>
+              <w:widowControl w:val="false"/>
+              <w:jc w:val="center"/>
+              <w:rPr>
+                <w:color w:val="000000"/>
+                <w:sz w:val="16"/>
+                <w:szCs w:val="16"/>
+              </w:rPr>
+            </w:pPr>
+            <w:r>
+              <w:rPr>
+                <w:color w:val="000000"/>
+                <w:sz w:val="16"/>
+                <w:szCs w:val="16"/>
+              </w:rPr>
             </w:r>
           </w:p>
         </w:tc>
@@ -51591,32 +51575,39 @@
               </w:rPr>
             </w:pPr>
             <w:r>
-              <w:rPr/>
-            </w:r>
-          </w:p>
-        </w:tc>
-        <w:tc>
-          <w:tcPr>
-            <w:tcW w:w="1016" w:type="dxa"/>
-            <w:tcBorders>
-              <w:top w:val="single" w:sz="4" w:space="0" w:color="000000"/>
-              <w:left w:val="single" w:sz="4" w:space="0" w:color="000000"/>
-              <w:bottom w:val="single" w:sz="4" w:space="0" w:color="000000"/>
-            </w:tcBorders>
-            <w:vAlign w:val="bottom"/>
-          </w:tcPr>
-          <w:p>
-            <w:pPr>
-              <w:pStyle w:val="Normal"/>
-              <w:widowControl w:val="false"/>
-              <w:jc w:val="center"/>
-              <w:rPr>
-                <w:sz w:val="16"/>
-                <w:szCs w:val="16"/>
-              </w:rPr>
-            </w:pPr>
-            <w:r>
-              <w:rPr/>
+              <w:rPr>
+                <w:color w:val="000000"/>
+                <w:sz w:val="16"/>
+                <w:szCs w:val="16"/>
+              </w:rPr>
+            </w:r>
+          </w:p>
+        </w:tc>
+        <w:tc>
+          <w:tcPr>
+            <w:tcW w:w="1016" w:type="dxa"/>
+            <w:tcBorders>
+              <w:top w:val="single" w:sz="4" w:space="0" w:color="000000"/>
+              <w:left w:val="single" w:sz="4" w:space="0" w:color="000000"/>
+              <w:bottom w:val="single" w:sz="4" w:space="0" w:color="000000"/>
+            </w:tcBorders>
+            <w:vAlign w:val="bottom"/>
+          </w:tcPr>
+          <w:p>
+            <w:pPr>
+              <w:pStyle w:val="Normal"/>
+              <w:widowControl w:val="false"/>
+              <w:jc w:val="center"/>
+              <w:rPr>
+                <w:sz w:val="16"/>
+                <w:szCs w:val="16"/>
+              </w:rPr>
+            </w:pPr>
+            <w:r>
+              <w:rPr>
+                <w:sz w:val="16"/>
+                <w:szCs w:val="16"/>
+              </w:rPr>
             </w:r>
           </w:p>
         </w:tc>
@@ -51643,7 +51634,12 @@
               </w:rPr>
             </w:pPr>
             <w:r>
-              <w:rPr/>
+              <w:rPr>
+                <w:rFonts w:eastAsia="arial" w:ascii="arial" w:hAnsi="arial"/>
+                <w:color w:val="000000"/>
+                <w:sz w:val="16"/>
+                <w:szCs w:val="16"/>
+              </w:rPr>
             </w:r>
           </w:p>
         </w:tc>
@@ -51851,25 +51847,7 @@
           <w:szCs w:val="16"/>
         </w:rPr>
         <w:tab/>
-        <w:t xml:space="preserve">           Class 3</w:t>
-      </w:r>
-      <w:r>
-        <w:rPr>
-          <w:rFonts w:eastAsia="arial" w:ascii="arial" w:hAnsi="arial"/>
-          <w:color w:val="000000"/>
-          <w:sz w:val="16"/>
-          <w:szCs w:val="16"/>
-        </w:rPr>
-        <w:t>33</w:t>
-      </w:r>
-      <w:r>
-        <w:rPr>
-          <w:rFonts w:eastAsia="arial" w:ascii="arial" w:hAnsi="arial"/>
-          <w:color w:val="000000"/>
-          <w:sz w:val="16"/>
-          <w:szCs w:val="16"/>
-        </w:rPr>
-        <w:t>-1</w:t>
+        <w:t xml:space="preserve">           Class 333-1</w:t>
       </w:r>
     </w:p>
     <w:tbl>
@@ -52152,32 +52130,39 @@
               </w:rPr>
             </w:pPr>
             <w:r>
-              <w:rPr/>
-            </w:r>
-          </w:p>
-        </w:tc>
-        <w:tc>
-          <w:tcPr>
-            <w:tcW w:w="1016" w:type="dxa"/>
-            <w:tcBorders>
-              <w:top w:val="single" w:sz="4" w:space="0" w:color="000000"/>
-              <w:left w:val="single" w:sz="4" w:space="0" w:color="000000"/>
-              <w:bottom w:val="single" w:sz="4" w:space="0" w:color="000000"/>
-            </w:tcBorders>
-            <w:vAlign w:val="bottom"/>
-          </w:tcPr>
-          <w:p>
-            <w:pPr>
-              <w:pStyle w:val="Normal"/>
-              <w:widowControl w:val="false"/>
-              <w:jc w:val="center"/>
-              <w:rPr>
-                <w:sz w:val="16"/>
-                <w:szCs w:val="16"/>
-              </w:rPr>
-            </w:pPr>
-            <w:r>
-              <w:rPr/>
+              <w:rPr>
+                <w:color w:val="000000"/>
+                <w:sz w:val="16"/>
+                <w:szCs w:val="16"/>
+              </w:rPr>
+            </w:r>
+          </w:p>
+        </w:tc>
+        <w:tc>
+          <w:tcPr>
+            <w:tcW w:w="1016" w:type="dxa"/>
+            <w:tcBorders>
+              <w:top w:val="single" w:sz="4" w:space="0" w:color="000000"/>
+              <w:left w:val="single" w:sz="4" w:space="0" w:color="000000"/>
+              <w:bottom w:val="single" w:sz="4" w:space="0" w:color="000000"/>
+            </w:tcBorders>
+            <w:vAlign w:val="bottom"/>
+          </w:tcPr>
+          <w:p>
+            <w:pPr>
+              <w:pStyle w:val="Normal"/>
+              <w:widowControl w:val="false"/>
+              <w:jc w:val="center"/>
+              <w:rPr>
+                <w:sz w:val="16"/>
+                <w:szCs w:val="16"/>
+              </w:rPr>
+            </w:pPr>
+            <w:r>
+              <w:rPr>
+                <w:sz w:val="16"/>
+                <w:szCs w:val="16"/>
+              </w:rPr>
             </w:r>
           </w:p>
         </w:tc>
@@ -52398,25 +52383,7 @@
           <w:szCs w:val="16"/>
         </w:rPr>
         <w:tab/>
-        <w:t xml:space="preserve">           Class 3</w:t>
-      </w:r>
-      <w:r>
-        <w:rPr>
-          <w:rFonts w:eastAsia="arial" w:ascii="arial" w:hAnsi="arial"/>
-          <w:color w:val="000000"/>
-          <w:sz w:val="16"/>
-          <w:szCs w:val="16"/>
-        </w:rPr>
-        <w:t>33</w:t>
-      </w:r>
-      <w:r>
-        <w:rPr>
-          <w:rFonts w:eastAsia="arial" w:ascii="arial" w:hAnsi="arial"/>
-          <w:color w:val="000000"/>
-          <w:sz w:val="16"/>
-          <w:szCs w:val="16"/>
-        </w:rPr>
-        <w:t>-2</w:t>
+        <w:t xml:space="preserve">           Class 333-2</w:t>
       </w:r>
     </w:p>
     <w:tbl>
@@ -52699,32 +52666,39 @@
               </w:rPr>
             </w:pPr>
             <w:r>
-              <w:rPr/>
-            </w:r>
-          </w:p>
-        </w:tc>
-        <w:tc>
-          <w:tcPr>
-            <w:tcW w:w="1016" w:type="dxa"/>
-            <w:tcBorders>
-              <w:top w:val="single" w:sz="4" w:space="0" w:color="000000"/>
-              <w:left w:val="single" w:sz="4" w:space="0" w:color="000000"/>
-              <w:bottom w:val="single" w:sz="4" w:space="0" w:color="000000"/>
-            </w:tcBorders>
-            <w:vAlign w:val="bottom"/>
-          </w:tcPr>
-          <w:p>
-            <w:pPr>
-              <w:pStyle w:val="Normal"/>
-              <w:widowControl w:val="false"/>
-              <w:jc w:val="center"/>
-              <w:rPr>
-                <w:sz w:val="16"/>
-                <w:szCs w:val="16"/>
-              </w:rPr>
-            </w:pPr>
-            <w:r>
-              <w:rPr/>
+              <w:rPr>
+                <w:color w:val="000000"/>
+                <w:sz w:val="16"/>
+                <w:szCs w:val="16"/>
+              </w:rPr>
+            </w:r>
+          </w:p>
+        </w:tc>
+        <w:tc>
+          <w:tcPr>
+            <w:tcW w:w="1016" w:type="dxa"/>
+            <w:tcBorders>
+              <w:top w:val="single" w:sz="4" w:space="0" w:color="000000"/>
+              <w:left w:val="single" w:sz="4" w:space="0" w:color="000000"/>
+              <w:bottom w:val="single" w:sz="4" w:space="0" w:color="000000"/>
+            </w:tcBorders>
+            <w:vAlign w:val="bottom"/>
+          </w:tcPr>
+          <w:p>
+            <w:pPr>
+              <w:pStyle w:val="Normal"/>
+              <w:widowControl w:val="false"/>
+              <w:jc w:val="center"/>
+              <w:rPr>
+                <w:sz w:val="16"/>
+                <w:szCs w:val="16"/>
+              </w:rPr>
+            </w:pPr>
+            <w:r>
+              <w:rPr>
+                <w:sz w:val="16"/>
+                <w:szCs w:val="16"/>
+              </w:rPr>
             </w:r>
           </w:p>
         </w:tc>
@@ -52751,7 +52725,12 @@
               </w:rPr>
             </w:pPr>
             <w:r>
-              <w:rPr/>
+              <w:rPr>
+                <w:rFonts w:eastAsia="arial" w:ascii="arial" w:hAnsi="arial"/>
+                <w:color w:val="000000"/>
+                <w:sz w:val="16"/>
+                <w:szCs w:val="16"/>
+              </w:rPr>
             </w:r>
           </w:p>
         </w:tc>
@@ -53963,12 +53942,12 @@
       <w:rFonts w:ascii="Symbol" w:hAnsi="Symbol" w:cs="Symbol"/>
     </w:rPr>
   </w:style>
-  <w:style w:type="character" w:styleId="Style5" w:customStyle="1">
-    <w:name w:val="번호 매기기 기호"/>
+  <w:style w:type="character" w:styleId="user" w:customStyle="1">
+    <w:name w:val="번호 매기기 기호 (user)"/>
     <w:qFormat/>
     <w:rPr/>
   </w:style>
-  <w:style w:type="paragraph" w:styleId="Style6">
+  <w:style w:type="paragraph" w:styleId="Style5">
     <w:name w:val="제목"/>
     <w:basedOn w:val="Normal"/>
     <w:next w:val="BodyText"/>
@@ -53978,7 +53957,7 @@
       <w:spacing w:before="240" w:after="120"/>
     </w:pPr>
     <w:rPr>
-      <w:rFonts w:ascii="Liberation Sans" w:hAnsi="Liberation Sans" w:eastAsia="나눔고딕" w:cs="Arial"/>
+      <w:rFonts w:ascii="Liberation Sans" w:hAnsi="Liberation Sans" w:eastAsia="Noto Sans CJK KR" w:cs="Lohit Devanagari"/>
       <w:sz w:val="28"/>
       <w:szCs w:val="28"/>
     </w:rPr>
@@ -54015,7 +53994,7 @@
       <w:szCs w:val="24"/>
     </w:rPr>
   </w:style>
-  <w:style w:type="paragraph" w:styleId="Style7">
+  <w:style w:type="paragraph" w:styleId="Style6" w:customStyle="1">
     <w:name w:val="색인"/>
     <w:basedOn w:val="Normal"/>
     <w:qFormat/>
@@ -54023,11 +54002,10 @@
       <w:suppressLineNumbers/>
     </w:pPr>
     <w:rPr>
-      <w:rFonts w:cs="Arial"/>
-      <w:sz w:val="24"/>
+      <w:rFonts w:cs="Lohit Devanagari"/>
     </w:rPr>
   </w:style>
-  <w:style w:type="paragraph" w:styleId="user">
+  <w:style w:type="paragraph" w:styleId="user1">
     <w:name w:val="제목 (user)"/>
     <w:basedOn w:val="Normal"/>
     <w:next w:val="BodyText"/>
@@ -54037,12 +54015,12 @@
       <w:spacing w:before="240" w:after="120"/>
     </w:pPr>
     <w:rPr>
-      <w:rFonts w:ascii="Liberation Sans" w:hAnsi="Liberation Sans" w:eastAsia="Noto Sans CJK KR" w:cs="Lohit Devanagari"/>
+      <w:rFonts w:ascii="Liberation Sans" w:hAnsi="Liberation Sans" w:eastAsia="나눔고딕" w:cs="Arial"/>
       <w:sz w:val="28"/>
       <w:szCs w:val="28"/>
     </w:rPr>
   </w:style>
-  <w:style w:type="paragraph" w:styleId="user1" w:customStyle="1">
+  <w:style w:type="paragraph" w:styleId="user2">
     <w:name w:val="색인 (user)"/>
     <w:basedOn w:val="Normal"/>
     <w:qFormat/>
@@ -54050,7 +54028,8 @@
       <w:suppressLineNumbers/>
     </w:pPr>
     <w:rPr>
-      <w:rFonts w:cs="Lohit Devanagari"/>
+      <w:rFonts w:cs="Arial"/>
+      <w:sz w:val="24"/>
     </w:rPr>
   </w:style>
   <w:style w:type="paragraph" w:styleId="Title">
@@ -54732,8 +54711,8 @@
       <w:szCs w:val="24"/>
     </w:rPr>
   </w:style>
-  <w:style w:type="paragraph" w:styleId="user2" w:customStyle="1">
-    <w:name w:val="표 내용 (user)"/>
+  <w:style w:type="paragraph" w:styleId="Style7" w:customStyle="1">
+    <w:name w:val="표 내용"/>
     <w:basedOn w:val="Normal"/>
     <w:qFormat/>
     <w:pPr>
@@ -54741,9 +54720,9 @@
     </w:pPr>
     <w:rPr/>
   </w:style>
-  <w:style w:type="paragraph" w:styleId="user3" w:customStyle="1">
-    <w:name w:val="표제목 (user)"/>
-    <w:basedOn w:val="user2"/>
+  <w:style w:type="paragraph" w:styleId="Style8" w:customStyle="1">
+    <w:name w:val="표제목"/>
+    <w:basedOn w:val="Style7"/>
     <w:qFormat/>
     <w:pPr>
       <w:jc w:val="center"/>
@@ -54753,8 +54732,8 @@
       <w:bCs/>
     </w:rPr>
   </w:style>
-  <w:style w:type="paragraph" w:styleId="Style8">
-    <w:name w:val="표 내용"/>
+  <w:style w:type="paragraph" w:styleId="user3">
+    <w:name w:val="표 내용 (user)"/>
     <w:basedOn w:val="Normal"/>
     <w:qFormat/>
     <w:pPr>
@@ -54763,9 +54742,9 @@
     </w:pPr>
     <w:rPr/>
   </w:style>
-  <w:style w:type="paragraph" w:styleId="Style9">
-    <w:name w:val="표제목"/>
-    <w:basedOn w:val="Style8"/>
+  <w:style w:type="paragraph" w:styleId="user4">
+    <w:name w:val="표제목 (user)"/>
+    <w:basedOn w:val="user3"/>
     <w:qFormat/>
     <w:pPr>
       <w:suppressLineNumbers/>

</xml_diff>